<commit_message>
[docs](main): 20+32주차 작업일지 업로드
</commit_message>
<xml_diff>
--- a/작업일지/졸업작품 작업일지 - 20+32주차.docx
+++ b/작업일지/졸업작품 작업일지 - 20+32주차.docx
@@ -179,6 +179,7 @@
                 <w:sz w:val="22"/>
               </w:rPr>
             </w:pPr>
+            <w:proofErr w:type="spellStart"/>
             <w:r>
               <w:rPr>
                 <w:rFonts w:hint="eastAsia"/>
@@ -187,6 +188,7 @@
               </w:rPr>
               <w:t>팀명</w:t>
             </w:r>
+            <w:proofErr w:type="spellEnd"/>
           </w:p>
         </w:tc>
         <w:tc>
@@ -499,6 +501,7 @@
             <w:pPr>
               <w:jc w:val="left"/>
               <w:rPr>
+                <w:rFonts w:hint="eastAsia"/>
                 <w:b/>
               </w:rPr>
             </w:pPr>
@@ -514,7 +517,39 @@
                 <w:rFonts w:hint="eastAsia"/>
                 <w:b/>
               </w:rPr>
-              <w:t>논문 포스터 작성, 온라인 모드에 스킬 시스템 적용, 피격 시 넉백 구현, ragdoll body마다 damping과 noise 별도 설정 등 보정, 아군 공격 방지, 충돌 피드백 튜닝</w:t>
+              <w:t xml:space="preserve">거점 시스템 추가, 지형 레벨디자인 완료, 피격 애니메이션 </w:t>
+            </w:r>
+            <w:proofErr w:type="spellStart"/>
+            <w:r>
+              <w:rPr>
+                <w:rFonts w:hint="eastAsia"/>
+                <w:b/>
+              </w:rPr>
+              <w:t>미재생</w:t>
+            </w:r>
+            <w:proofErr w:type="spellEnd"/>
+            <w:r>
+              <w:rPr>
+                <w:rFonts w:hint="eastAsia"/>
+                <w:b/>
+              </w:rPr>
+              <w:t xml:space="preserve"> 버그 수정, 중력 버그 수정, </w:t>
+            </w:r>
+            <w:proofErr w:type="spellStart"/>
+            <w:r>
+              <w:rPr>
+                <w:rFonts w:hint="eastAsia"/>
+                <w:b/>
+              </w:rPr>
+              <w:t>청크</w:t>
+            </w:r>
+            <w:proofErr w:type="spellEnd"/>
+            <w:r>
+              <w:rPr>
+                <w:rFonts w:hint="eastAsia"/>
+                <w:b/>
+              </w:rPr>
+              <w:t xml:space="preserve"> 스트리밍 구현, Zone 시스템 추가</w:t>
             </w:r>
           </w:p>
           <w:p>
@@ -538,12 +573,14 @@
               </w:rPr>
               <w:t xml:space="preserve"> </w:t>
             </w:r>
+            <w:proofErr w:type="spellStart"/>
             <w:r>
               <w:rPr>
                 <w:b/>
               </w:rPr>
               <w:t>이시스</w:t>
             </w:r>
+            <w:proofErr w:type="spellEnd"/>
             <w:r>
               <w:rPr>
                 <w:rFonts w:hint="eastAsia"/>
@@ -565,6 +602,7 @@
               </w:rPr>
               <w:t xml:space="preserve">이종진: </w:t>
             </w:r>
+            <w:proofErr w:type="spellStart"/>
             <w:r>
               <w:rPr>
                 <w:rFonts w:hint="eastAsia"/>
@@ -572,7 +610,17 @@
                 <w:bCs/>
                 <w:szCs w:val="20"/>
               </w:rPr>
-              <w:t>로비씬 디자인</w:t>
+              <w:t>로비씬</w:t>
+            </w:r>
+            <w:proofErr w:type="spellEnd"/>
+            <w:r>
+              <w:rPr>
+                <w:rFonts w:hint="eastAsia"/>
+                <w:b/>
+                <w:bCs/>
+                <w:szCs w:val="20"/>
+              </w:rPr>
+              <w:t xml:space="preserve"> 디자인</w:t>
             </w:r>
           </w:p>
         </w:tc>
@@ -637,7 +685,7 @@
           <w:rFonts w:hint="eastAsia"/>
           <w:sz w:val="22"/>
         </w:rPr>
-        <w:t>논문 포스터 작성</w:t>
+        <w:t>거점 시스템 추가</w:t>
       </w:r>
     </w:p>
     <w:p>
@@ -658,7 +706,196 @@
           <w:rFonts w:hint="eastAsia"/>
           <w:sz w:val="22"/>
         </w:rPr>
-        <w:t>5월 30일 발표</w:t>
+        <w:t xml:space="preserve">거점 주위로 몬스터가 생성되고, 거점이 살아있는 동안은 계속 몬스터가 </w:t>
+      </w:r>
+      <w:proofErr w:type="spellStart"/>
+      <w:r>
+        <w:rPr>
+          <w:rFonts w:hint="eastAsia"/>
+          <w:sz w:val="22"/>
+        </w:rPr>
+        <w:t>리스폰된다</w:t>
+      </w:r>
+      <w:proofErr w:type="spellEnd"/>
+      <w:r>
+        <w:rPr>
+          <w:rFonts w:hint="eastAsia"/>
+          <w:sz w:val="22"/>
+        </w:rPr>
+        <w:t>.</w:t>
+      </w:r>
+      <w:r>
+        <w:rPr>
+          <w:sz w:val="22"/>
+        </w:rPr>
+        <w:br/>
+      </w:r>
+      <w:r>
+        <w:rPr>
+          <w:rFonts w:hint="eastAsia"/>
+          <w:sz w:val="22"/>
+        </w:rPr>
+        <w:t xml:space="preserve">몬스터의 </w:t>
+      </w:r>
+      <w:proofErr w:type="spellStart"/>
+      <w:r>
+        <w:rPr>
+          <w:rFonts w:hint="eastAsia"/>
+          <w:sz w:val="22"/>
+        </w:rPr>
+        <w:t>리스폰을</w:t>
+      </w:r>
+      <w:proofErr w:type="spellEnd"/>
+      <w:r>
+        <w:rPr>
+          <w:rFonts w:hint="eastAsia"/>
+          <w:sz w:val="22"/>
+        </w:rPr>
+        <w:t xml:space="preserve"> 막으려면 거점을 깨야 한다.</w:t>
+      </w:r>
+    </w:p>
+    <w:p>
+      <w:pPr>
+        <w:pStyle w:val="a3"/>
+        <w:numPr>
+          <w:ilvl w:val="1"/>
+          <w:numId w:val="1"/>
+        </w:numPr>
+        <w:ind w:leftChars="0"/>
+        <w:jc w:val="left"/>
+        <w:rPr>
+          <w:sz w:val="22"/>
+        </w:rPr>
+      </w:pPr>
+      <w:r>
+        <w:rPr>
+          <w:rFonts w:hint="eastAsia"/>
+          <w:sz w:val="22"/>
+        </w:rPr>
+        <w:t xml:space="preserve">거점별로 체력, 생성되는 몬스터 종류와 최대 수, </w:t>
+      </w:r>
+      <w:proofErr w:type="spellStart"/>
+      <w:r>
+        <w:rPr>
+          <w:rFonts w:hint="eastAsia"/>
+          <w:sz w:val="22"/>
+        </w:rPr>
+        <w:t>스폰</w:t>
+      </w:r>
+      <w:proofErr w:type="spellEnd"/>
+      <w:r>
+        <w:rPr>
+          <w:rFonts w:hint="eastAsia"/>
+          <w:sz w:val="22"/>
+        </w:rPr>
+        <w:t xml:space="preserve"> 반경, 활동 반경, 한 웨이브의 최대 몬스터 수, 몬스터 </w:t>
+      </w:r>
+      <w:proofErr w:type="spellStart"/>
+      <w:r>
+        <w:rPr>
+          <w:rFonts w:hint="eastAsia"/>
+          <w:sz w:val="22"/>
+        </w:rPr>
+        <w:t>리스폰</w:t>
+      </w:r>
+      <w:proofErr w:type="spellEnd"/>
+      <w:r>
+        <w:rPr>
+          <w:rFonts w:hint="eastAsia"/>
+          <w:sz w:val="22"/>
+        </w:rPr>
+        <w:t xml:space="preserve"> 시간, 거점 </w:t>
+      </w:r>
+      <w:proofErr w:type="spellStart"/>
+      <w:r>
+        <w:rPr>
+          <w:rFonts w:hint="eastAsia"/>
+          <w:sz w:val="22"/>
+        </w:rPr>
+        <w:t>리스폰</w:t>
+      </w:r>
+      <w:proofErr w:type="spellEnd"/>
+      <w:r>
+        <w:rPr>
+          <w:rFonts w:hint="eastAsia"/>
+          <w:sz w:val="22"/>
+        </w:rPr>
+        <w:t xml:space="preserve"> 시간 등을 정의해 사용</w:t>
+      </w:r>
+    </w:p>
+    <w:p>
+      <w:pPr>
+        <w:pStyle w:val="a3"/>
+        <w:numPr>
+          <w:ilvl w:val="1"/>
+          <w:numId w:val="1"/>
+        </w:numPr>
+        <w:ind w:leftChars="0"/>
+        <w:jc w:val="left"/>
+        <w:rPr>
+          <w:sz w:val="22"/>
+        </w:rPr>
+      </w:pPr>
+      <w:r>
+        <w:rPr>
+          <w:rFonts w:hint="eastAsia"/>
+          <w:sz w:val="22"/>
+        </w:rPr>
+        <w:t xml:space="preserve">현재 모델은 큐브 모양, 체력바는 노란색으로 렌더링, 모델은 </w:t>
+      </w:r>
+      <w:proofErr w:type="spellStart"/>
+      <w:r>
+        <w:rPr>
+          <w:rFonts w:hint="eastAsia"/>
+          <w:sz w:val="22"/>
+        </w:rPr>
+        <w:t>에셋</w:t>
+      </w:r>
+      <w:proofErr w:type="spellEnd"/>
+      <w:r>
+        <w:rPr>
+          <w:rFonts w:hint="eastAsia"/>
+          <w:sz w:val="22"/>
+        </w:rPr>
+        <w:t xml:space="preserve"> 구할 예정</w:t>
+      </w:r>
+    </w:p>
+    <w:p>
+      <w:pPr>
+        <w:pStyle w:val="a3"/>
+        <w:numPr>
+          <w:ilvl w:val="1"/>
+          <w:numId w:val="1"/>
+        </w:numPr>
+        <w:ind w:leftChars="0"/>
+        <w:jc w:val="left"/>
+        <w:rPr>
+          <w:rFonts w:hint="eastAsia"/>
+          <w:sz w:val="22"/>
+        </w:rPr>
+      </w:pPr>
+      <w:r>
+        <w:rPr>
+          <w:rFonts w:hint="eastAsia"/>
+          <w:sz w:val="22"/>
+        </w:rPr>
+        <w:t xml:space="preserve">집단 전투 진입 시 주위 거점 파괴 여부로 생성되는 몬스터 수 변화, </w:t>
+      </w:r>
+      <w:proofErr w:type="spellStart"/>
+      <w:r>
+        <w:rPr>
+          <w:rFonts w:hint="eastAsia"/>
+          <w:sz w:val="22"/>
+        </w:rPr>
+        <w:t>스탯</w:t>
+      </w:r>
+      <w:proofErr w:type="spellEnd"/>
+      <w:r>
+        <w:rPr>
+          <w:rFonts w:hint="eastAsia"/>
+          <w:sz w:val="22"/>
+        </w:rPr>
+        <w:t xml:space="preserve"> 변화 등 고려 예정</w:t>
       </w:r>
     </w:p>
     <w:p>
@@ -679,7 +916,7 @@
           <w:rFonts w:hint="eastAsia"/>
           <w:sz w:val="22"/>
         </w:rPr>
-        <w:t>온라인 모드에 스킬 시스템 적용</w:t>
+        <w:t>지형 레벨디자인 완료</w:t>
       </w:r>
     </w:p>
     <w:p>
@@ -700,7 +937,36 @@
           <w:rFonts w:hint="eastAsia"/>
           <w:sz w:val="22"/>
         </w:rPr>
-        <w:t>서버에서도 캐릭터 애니메이션을 수행 (baked animation 활용)</w:t>
+        <w:t xml:space="preserve">2D 레벨디자인 기반으로 유니티 Terrain Tool로 직접 </w:t>
+      </w:r>
+      <w:proofErr w:type="spellStart"/>
+      <w:r>
+        <w:rPr>
+          <w:rFonts w:hint="eastAsia"/>
+          <w:sz w:val="22"/>
+        </w:rPr>
+        <w:t>브러쉬를</w:t>
+      </w:r>
+      <w:proofErr w:type="spellEnd"/>
+      <w:r>
+        <w:rPr>
+          <w:rFonts w:hint="eastAsia"/>
+          <w:sz w:val="22"/>
+        </w:rPr>
+        <w:t xml:space="preserve"> 통해 그렸음.</w:t>
+      </w:r>
+      <w:r>
+        <w:rPr>
+          <w:sz w:val="22"/>
+        </w:rPr>
+        <w:br/>
+      </w:r>
+      <w:r>
+        <w:rPr>
+          <w:rFonts w:hint="eastAsia"/>
+          <w:sz w:val="22"/>
+        </w:rPr>
+        <w:t>나무와 풀, 바위는 랜덤 배치 예정</w:t>
       </w:r>
     </w:p>
     <w:p>
@@ -713,15 +979,16 @@
         <w:ind w:leftChars="0"/>
         <w:jc w:val="left"/>
         <w:rPr>
-          <w:sz w:val="22"/>
-        </w:rPr>
-      </w:pPr>
-      <w:r>
-        <w:rPr>
-          <w:rFonts w:hint="eastAsia"/>
-          <w:sz w:val="22"/>
-        </w:rPr>
-        <w:t>애니메이션에 기반한 정확한 bounding volume 위치로 공격 hitbox의 변환과</w:t>
+          <w:rFonts w:hint="eastAsia"/>
+          <w:sz w:val="22"/>
+        </w:rPr>
+      </w:pPr>
+      <w:r>
+        <w:rPr>
+          <w:rFonts w:hint="eastAsia"/>
+          <w:sz w:val="22"/>
+        </w:rPr>
+        <w:t>인벤토리와 레어 무기 획득 등의 구현 가능 여부가 불투명함에 따라 아이템 획득처로</w:t>
       </w:r>
       <w:r>
         <w:rPr>
@@ -729,12 +996,200 @@
         </w:rPr>
         <w:br/>
       </w:r>
-      <w:r>
-        <w:rPr>
-          <w:rFonts w:hint="eastAsia"/>
-          <w:sz w:val="22"/>
-        </w:rPr>
-        <w:t>피격 여부 계산</w:t>
+      <w:proofErr w:type="spellStart"/>
+      <w:r>
+        <w:rPr>
+          <w:rFonts w:hint="eastAsia"/>
+          <w:sz w:val="22"/>
+        </w:rPr>
+        <w:t>마련해놓은</w:t>
+      </w:r>
+      <w:proofErr w:type="spellEnd"/>
+      <w:r>
+        <w:rPr>
+          <w:rFonts w:hint="eastAsia"/>
+          <w:sz w:val="22"/>
+        </w:rPr>
+        <w:t xml:space="preserve"> 사이드 경로는 폐기</w:t>
+      </w:r>
+    </w:p>
+    <w:p>
+      <w:pPr>
+        <w:widowControl/>
+        <w:wordWrap/>
+        <w:autoSpaceDE/>
+        <w:autoSpaceDN/>
+        <w:rPr>
+          <w:sz w:val="22"/>
+        </w:rPr>
+      </w:pPr>
+      <w:r>
+        <w:rPr>
+          <w:sz w:val="22"/>
+        </w:rPr>
+        <w:br w:type="page"/>
+      </w:r>
+    </w:p>
+    <w:p>
+      <w:pPr>
+        <w:jc w:val="left"/>
+        <w:rPr>
+          <w:rFonts w:hint="eastAsia"/>
+          <w:sz w:val="22"/>
+        </w:rPr>
+      </w:pPr>
+    </w:p>
+    <w:p>
+      <w:pPr>
+        <w:pStyle w:val="a3"/>
+        <w:ind w:leftChars="0" w:left="1200"/>
+        <w:jc w:val="left"/>
+        <w:rPr>
+          <w:sz w:val="22"/>
+        </w:rPr>
+      </w:pPr>
+      <w:r>
+        <w:rPr>
+          <w:noProof/>
+          <w:sz w:val="24"/>
+          <w:szCs w:val="28"/>
+        </w:rPr>
+        <w:drawing>
+          <wp:inline distT="0" distB="0" distL="0" distR="0" wp14:anchorId="17294D92" wp14:editId="05CC2D34">
+            <wp:extent cx="5400000" cy="3178019"/>
+            <wp:effectExtent l="0" t="0" r="0" b="3810"/>
+            <wp:docPr id="274567447" name="그림 2" descr="도표, 그림, 종이접기, 디자인이(가) 표시된 사진&#10;&#10;자동 생성된 설명"/>
+            <wp:cNvGraphicFramePr>
+              <a:graphicFrameLocks xmlns:a="http://schemas.openxmlformats.org/drawingml/2006/main" noChangeAspect="1"/>
+            </wp:cNvGraphicFramePr>
+            <a:graphic xmlns:a="http://schemas.openxmlformats.org/drawingml/2006/main">
+              <a:graphicData uri="http://schemas.openxmlformats.org/drawingml/2006/picture">
+                <pic:pic xmlns:pic="http://schemas.openxmlformats.org/drawingml/2006/picture">
+                  <pic:nvPicPr>
+                    <pic:cNvPr id="274567447" name="그림 2" descr="도표, 그림, 종이접기, 디자인이(가) 표시된 사진&#10;&#10;자동 생성된 설명"/>
+                    <pic:cNvPicPr/>
+                  </pic:nvPicPr>
+                  <pic:blipFill>
+                    <a:blip r:embed="rId7" cstate="print">
+                      <a:extLst>
+                        <a:ext uri="{28A0092B-C50C-407E-A947-70E740481C1C}">
+                          <a14:useLocalDpi xmlns:a14="http://schemas.microsoft.com/office/drawing/2010/main" val="0"/>
+                        </a:ext>
+                      </a:extLst>
+                    </a:blip>
+                    <a:stretch>
+                      <a:fillRect/>
+                    </a:stretch>
+                  </pic:blipFill>
+                  <pic:spPr>
+                    <a:xfrm>
+                      <a:off x="0" y="0"/>
+                      <a:ext cx="5400000" cy="3178019"/>
+                    </a:xfrm>
+                    <a:prstGeom prst="rect">
+                      <a:avLst/>
+                    </a:prstGeom>
+                  </pic:spPr>
+                </pic:pic>
+              </a:graphicData>
+            </a:graphic>
+          </wp:inline>
+        </w:drawing>
+      </w:r>
+    </w:p>
+    <w:p>
+      <w:pPr>
+        <w:ind w:left="800"/>
+        <w:jc w:val="left"/>
+        <w:rPr>
+          <w:rFonts w:hint="eastAsia"/>
+          <w:sz w:val="22"/>
+        </w:rPr>
+      </w:pPr>
+      <w:r>
+        <w:rPr>
+          <w:rFonts w:hint="eastAsia"/>
+          <w:noProof/>
+          <w:sz w:val="22"/>
+        </w:rPr>
+        <w:drawing>
+          <wp:inline distT="0" distB="0" distL="0" distR="0" wp14:anchorId="0A652999" wp14:editId="563A2CE7">
+            <wp:extent cx="5400000" cy="2907930"/>
+            <wp:effectExtent l="0" t="0" r="0" b="6985"/>
+            <wp:docPr id="2147336821" name="그림 1"/>
+            <wp:cNvGraphicFramePr>
+              <a:graphicFrameLocks xmlns:a="http://schemas.openxmlformats.org/drawingml/2006/main" noChangeAspect="1"/>
+            </wp:cNvGraphicFramePr>
+            <a:graphic xmlns:a="http://schemas.openxmlformats.org/drawingml/2006/main">
+              <a:graphicData uri="http://schemas.openxmlformats.org/drawingml/2006/picture">
+                <pic:pic xmlns:pic="http://schemas.openxmlformats.org/drawingml/2006/picture">
+                  <pic:nvPicPr>
+                    <pic:cNvPr id="2147336821" name="그림 2147336821"/>
+                    <pic:cNvPicPr/>
+                  </pic:nvPicPr>
+                  <pic:blipFill>
+                    <a:blip r:embed="rId8">
+                      <a:extLst>
+                        <a:ext uri="{28A0092B-C50C-407E-A947-70E740481C1C}">
+                          <a14:useLocalDpi xmlns:a14="http://schemas.microsoft.com/office/drawing/2010/main" val="0"/>
+                        </a:ext>
+                      </a:extLst>
+                    </a:blip>
+                    <a:stretch>
+                      <a:fillRect/>
+                    </a:stretch>
+                  </pic:blipFill>
+                  <pic:spPr>
+                    <a:xfrm>
+                      <a:off x="0" y="0"/>
+                      <a:ext cx="5400000" cy="2907930"/>
+                    </a:xfrm>
+                    <a:prstGeom prst="rect">
+                      <a:avLst/>
+                    </a:prstGeom>
+                  </pic:spPr>
+                </pic:pic>
+              </a:graphicData>
+            </a:graphic>
+          </wp:inline>
+        </w:drawing>
+      </w:r>
+    </w:p>
+    <w:p>
+      <w:pPr>
+        <w:pStyle w:val="a3"/>
+        <w:numPr>
+          <w:ilvl w:val="0"/>
+          <w:numId w:val="1"/>
+        </w:numPr>
+        <w:ind w:leftChars="0"/>
+        <w:jc w:val="left"/>
+        <w:rPr>
+          <w:sz w:val="22"/>
+        </w:rPr>
+      </w:pPr>
+      <w:r>
+        <w:rPr>
+          <w:rFonts w:hint="eastAsia"/>
+          <w:sz w:val="22"/>
+        </w:rPr>
+        <w:t xml:space="preserve">피격 애니메이션 </w:t>
+      </w:r>
+      <w:proofErr w:type="spellStart"/>
+      <w:r>
+        <w:rPr>
+          <w:rFonts w:hint="eastAsia"/>
+          <w:sz w:val="22"/>
+        </w:rPr>
+        <w:t>미재생</w:t>
+      </w:r>
+      <w:proofErr w:type="spellEnd"/>
+      <w:r>
+        <w:rPr>
+          <w:rFonts w:hint="eastAsia"/>
+          <w:sz w:val="22"/>
+        </w:rPr>
+        <w:t xml:space="preserve"> 버그 수정</w:t>
       </w:r>
     </w:p>
     <w:p>
@@ -755,7 +1210,248 @@
           <w:rFonts w:hint="eastAsia"/>
           <w:sz w:val="22"/>
         </w:rPr>
-        <w:t>스킬 시스템에도 물리 시스템과 비슷한 SAP broad phase 적용</w:t>
+        <w:t>Skill System으로 인한 피격에는 피격 애니메이션을 재생하지 않고 있었음.</w:t>
+      </w:r>
+      <w:r>
+        <w:rPr>
+          <w:sz w:val="22"/>
+        </w:rPr>
+        <w:br/>
+      </w:r>
+      <w:r>
+        <w:rPr>
+          <w:rFonts w:hint="eastAsia"/>
+          <w:sz w:val="22"/>
+        </w:rPr>
+        <w:t>반응하도록 수정</w:t>
+      </w:r>
+    </w:p>
+    <w:p>
+      <w:pPr>
+        <w:pStyle w:val="a3"/>
+        <w:numPr>
+          <w:ilvl w:val="0"/>
+          <w:numId w:val="1"/>
+        </w:numPr>
+        <w:ind w:leftChars="0"/>
+        <w:jc w:val="left"/>
+        <w:rPr>
+          <w:sz w:val="22"/>
+        </w:rPr>
+      </w:pPr>
+      <w:r>
+        <w:rPr>
+          <w:rFonts w:hint="eastAsia"/>
+          <w:sz w:val="22"/>
+        </w:rPr>
+        <w:t>중력 버그 수정</w:t>
+      </w:r>
+    </w:p>
+    <w:p>
+      <w:pPr>
+        <w:pStyle w:val="a3"/>
+        <w:numPr>
+          <w:ilvl w:val="1"/>
+          <w:numId w:val="1"/>
+        </w:numPr>
+        <w:ind w:leftChars="0"/>
+        <w:jc w:val="left"/>
+        <w:rPr>
+          <w:sz w:val="22"/>
+        </w:rPr>
+      </w:pPr>
+      <w:r>
+        <w:rPr>
+          <w:sz w:val="22"/>
+        </w:rPr>
+        <w:t>S</w:t>
+      </w:r>
+      <w:r>
+        <w:rPr>
+          <w:rFonts w:hint="eastAsia"/>
+          <w:sz w:val="22"/>
+        </w:rPr>
+        <w:t xml:space="preserve">tandalone과 Online 모드의 코드 비통일 문제로, 예전에 물리가 덜 구현됐을 때 </w:t>
+      </w:r>
+      <w:proofErr w:type="spellStart"/>
+      <w:r>
+        <w:rPr>
+          <w:rFonts w:hint="eastAsia"/>
+          <w:sz w:val="22"/>
+        </w:rPr>
+        <w:t>processInput</w:t>
+      </w:r>
+      <w:proofErr w:type="spellEnd"/>
+      <w:r>
+        <w:rPr>
+          <w:rFonts w:hint="eastAsia"/>
+          <w:sz w:val="22"/>
+        </w:rPr>
+        <w:t xml:space="preserve">에서 damping을 구현하던 게 남아있어 online game에선 이중으로 damping이 들어갔음. -&gt; 중력이 현저하게 </w:t>
+      </w:r>
+      <w:proofErr w:type="spellStart"/>
+      <w:r>
+        <w:rPr>
+          <w:rFonts w:hint="eastAsia"/>
+          <w:sz w:val="22"/>
+        </w:rPr>
+        <w:t>낮아보이는</w:t>
+      </w:r>
+      <w:proofErr w:type="spellEnd"/>
+      <w:r>
+        <w:rPr>
+          <w:rFonts w:hint="eastAsia"/>
+          <w:sz w:val="22"/>
+        </w:rPr>
+        <w:t xml:space="preserve"> 버그의 원인이 되었음</w:t>
+      </w:r>
+    </w:p>
+    <w:p>
+      <w:pPr>
+        <w:pStyle w:val="a3"/>
+        <w:numPr>
+          <w:ilvl w:val="1"/>
+          <w:numId w:val="1"/>
+        </w:numPr>
+        <w:ind w:leftChars="0"/>
+        <w:jc w:val="left"/>
+        <w:rPr>
+          <w:sz w:val="22"/>
+        </w:rPr>
+      </w:pPr>
+      <w:r>
+        <w:rPr>
+          <w:rFonts w:hint="eastAsia"/>
+          <w:sz w:val="22"/>
+        </w:rPr>
+        <w:t xml:space="preserve">Online 모드 </w:t>
+      </w:r>
+      <w:proofErr w:type="spellStart"/>
+      <w:r>
+        <w:rPr>
+          <w:rFonts w:hint="eastAsia"/>
+          <w:sz w:val="22"/>
+        </w:rPr>
+        <w:t>processInput</w:t>
+      </w:r>
+      <w:proofErr w:type="spellEnd"/>
+      <w:r>
+        <w:rPr>
+          <w:rFonts w:hint="eastAsia"/>
+          <w:sz w:val="22"/>
+        </w:rPr>
+        <w:t xml:space="preserve"> 최신화로 수정</w:t>
+      </w:r>
+    </w:p>
+    <w:p>
+      <w:pPr>
+        <w:widowControl/>
+        <w:wordWrap/>
+        <w:autoSpaceDE/>
+        <w:autoSpaceDN/>
+        <w:rPr>
+          <w:rFonts w:hint="eastAsia"/>
+          <w:sz w:val="22"/>
+        </w:rPr>
+      </w:pPr>
+      <w:r>
+        <w:rPr>
+          <w:sz w:val="22"/>
+        </w:rPr>
+        <w:br w:type="page"/>
+      </w:r>
+    </w:p>
+    <w:p>
+      <w:pPr>
+        <w:pStyle w:val="a3"/>
+        <w:numPr>
+          <w:ilvl w:val="0"/>
+          <w:numId w:val="1"/>
+        </w:numPr>
+        <w:ind w:leftChars="0"/>
+        <w:jc w:val="left"/>
+        <w:rPr>
+          <w:sz w:val="22"/>
+        </w:rPr>
+      </w:pPr>
+      <w:proofErr w:type="spellStart"/>
+      <w:r>
+        <w:rPr>
+          <w:rFonts w:hint="eastAsia"/>
+          <w:sz w:val="22"/>
+        </w:rPr>
+        <w:lastRenderedPageBreak/>
+        <w:t>청크</w:t>
+      </w:r>
+      <w:proofErr w:type="spellEnd"/>
+      <w:r>
+        <w:rPr>
+          <w:rFonts w:hint="eastAsia"/>
+          <w:sz w:val="22"/>
+        </w:rPr>
+        <w:t xml:space="preserve"> 스트리밍 구현</w:t>
+      </w:r>
+    </w:p>
+    <w:p>
+      <w:pPr>
+        <w:pStyle w:val="a3"/>
+        <w:numPr>
+          <w:ilvl w:val="1"/>
+          <w:numId w:val="1"/>
+        </w:numPr>
+        <w:ind w:leftChars="0"/>
+        <w:jc w:val="left"/>
+        <w:rPr>
+          <w:sz w:val="22"/>
+        </w:rPr>
+      </w:pPr>
+      <w:proofErr w:type="spellStart"/>
+      <w:r>
+        <w:rPr>
+          <w:rFonts w:hint="eastAsia"/>
+          <w:sz w:val="22"/>
+        </w:rPr>
+        <w:t>청크</w:t>
+      </w:r>
+      <w:proofErr w:type="spellEnd"/>
+      <w:r>
+        <w:rPr>
+          <w:rFonts w:hint="eastAsia"/>
+          <w:sz w:val="22"/>
+        </w:rPr>
+        <w:t xml:space="preserve"> 사이즈는 200x200x200, 플레이어로부터 맨해튼 거리 3 이하의 chunk는 항상 </w:t>
+      </w:r>
+      <w:proofErr w:type="spellStart"/>
+      <w:r>
+        <w:rPr>
+          <w:rFonts w:hint="eastAsia"/>
+          <w:sz w:val="22"/>
+        </w:rPr>
+        <w:t>로드되어있도록</w:t>
+      </w:r>
+      <w:proofErr w:type="spellEnd"/>
+      <w:r>
+        <w:rPr>
+          <w:rFonts w:hint="eastAsia"/>
+          <w:sz w:val="22"/>
+        </w:rPr>
+        <w:t xml:space="preserve"> 하고, 그 외 chunk는 일정 시간의 유예를 두어 계속 플레이어 시야 바깥에 있을 경우 </w:t>
+      </w:r>
+      <w:proofErr w:type="spellStart"/>
+      <w:r>
+        <w:rPr>
+          <w:rFonts w:hint="eastAsia"/>
+          <w:sz w:val="22"/>
+        </w:rPr>
+        <w:t>언로드하도록</w:t>
+      </w:r>
+      <w:proofErr w:type="spellEnd"/>
+      <w:r>
+        <w:rPr>
+          <w:rFonts w:hint="eastAsia"/>
+          <w:sz w:val="22"/>
+        </w:rPr>
+        <w:t xml:space="preserve"> 구현</w:t>
       </w:r>
     </w:p>
     <w:p>
@@ -771,12 +1467,37 @@
           <w:sz w:val="22"/>
         </w:rPr>
       </w:pPr>
-      <w:r>
-        <w:rPr>
-          <w:rFonts w:hint="eastAsia"/>
-          <w:sz w:val="22"/>
-        </w:rPr>
-        <w:t>Object-Object 충돌이 아닌 Skill Hitbox-Object 충돌 판정이 필요하므로</w:t>
+      <w:proofErr w:type="spellStart"/>
+      <w:r>
+        <w:rPr>
+          <w:rFonts w:hint="eastAsia"/>
+          <w:sz w:val="22"/>
+        </w:rPr>
+        <w:t>청크</w:t>
+      </w:r>
+      <w:proofErr w:type="spellEnd"/>
+      <w:r>
+        <w:rPr>
+          <w:rFonts w:hint="eastAsia"/>
+          <w:sz w:val="22"/>
+        </w:rPr>
+        <w:t xml:space="preserve"> 로딩 과정 중 Terrain Mesh를 </w:t>
+      </w:r>
+      <w:proofErr w:type="spellStart"/>
+      <w:r>
+        <w:rPr>
+          <w:rFonts w:hint="eastAsia"/>
+          <w:sz w:val="22"/>
+        </w:rPr>
+        <w:t>cpu</w:t>
+      </w:r>
+      <w:proofErr w:type="spellEnd"/>
+      <w:r>
+        <w:rPr>
+          <w:rFonts w:hint="eastAsia"/>
+          <w:sz w:val="22"/>
+        </w:rPr>
+        <w:t>로 빌드하는 과정이 대부분의 시간을 차지</w:t>
       </w:r>
       <w:r>
         <w:rPr>
@@ -789,7 +1510,135 @@
           <w:rFonts w:hint="eastAsia"/>
           <w:sz w:val="22"/>
         </w:rPr>
-        <w:t>별도 구현</w:t>
+        <w:t xml:space="preserve">-&gt; 개별 </w:t>
+      </w:r>
+      <w:proofErr w:type="spellStart"/>
+      <w:r>
+        <w:rPr>
+          <w:rFonts w:hint="eastAsia"/>
+          <w:sz w:val="22"/>
+        </w:rPr>
+        <w:t>청크의</w:t>
+      </w:r>
+      <w:proofErr w:type="spellEnd"/>
+      <w:r>
+        <w:rPr>
+          <w:rFonts w:hint="eastAsia"/>
+          <w:sz w:val="22"/>
+        </w:rPr>
+        <w:t xml:space="preserve"> Terrain Mesh 빌드를 </w:t>
+      </w:r>
+      <w:proofErr w:type="spellStart"/>
+      <w:r>
+        <w:rPr>
+          <w:rFonts w:hint="eastAsia"/>
+          <w:sz w:val="22"/>
+        </w:rPr>
+        <w:t>스레드풀에</w:t>
+      </w:r>
+      <w:proofErr w:type="spellEnd"/>
+      <w:r>
+        <w:rPr>
+          <w:rFonts w:hint="eastAsia"/>
+          <w:sz w:val="22"/>
+        </w:rPr>
+        <w:t xml:space="preserve"> 넘겨 </w:t>
+      </w:r>
+      <w:proofErr w:type="spellStart"/>
+      <w:r>
+        <w:rPr>
+          <w:rFonts w:hint="eastAsia"/>
+          <w:sz w:val="22"/>
+        </w:rPr>
+        <w:t>멀티스레드로</w:t>
+      </w:r>
+      <w:proofErr w:type="spellEnd"/>
+      <w:r>
+        <w:rPr>
+          <w:rFonts w:hint="eastAsia"/>
+          <w:sz w:val="22"/>
+        </w:rPr>
+        <w:t xml:space="preserve"> 로드</w:t>
+      </w:r>
+    </w:p>
+    <w:p>
+      <w:pPr>
+        <w:pStyle w:val="a3"/>
+        <w:numPr>
+          <w:ilvl w:val="2"/>
+          <w:numId w:val="1"/>
+        </w:numPr>
+        <w:ind w:leftChars="0"/>
+        <w:jc w:val="left"/>
+        <w:rPr>
+          <w:sz w:val="22"/>
+        </w:rPr>
+      </w:pPr>
+      <w:r>
+        <w:rPr>
+          <w:sz w:val="22"/>
+        </w:rPr>
+        <w:t>S</w:t>
+      </w:r>
+      <w:r>
+        <w:rPr>
+          <w:rFonts w:hint="eastAsia"/>
+          <w:sz w:val="22"/>
+        </w:rPr>
+        <w:t xml:space="preserve">eamless </w:t>
+      </w:r>
+      <w:proofErr w:type="spellStart"/>
+      <w:r>
+        <w:rPr>
+          <w:rFonts w:hint="eastAsia"/>
+          <w:sz w:val="22"/>
+        </w:rPr>
+        <w:t>openworld</w:t>
+      </w:r>
+      <w:proofErr w:type="spellEnd"/>
+      <w:r>
+        <w:rPr>
+          <w:rFonts w:hint="eastAsia"/>
+          <w:sz w:val="22"/>
+        </w:rPr>
+        <w:t>인 셈?</w:t>
+      </w:r>
+    </w:p>
+    <w:p>
+      <w:pPr>
+        <w:pStyle w:val="a3"/>
+        <w:numPr>
+          <w:ilvl w:val="1"/>
+          <w:numId w:val="1"/>
+        </w:numPr>
+        <w:ind w:leftChars="0"/>
+        <w:jc w:val="left"/>
+        <w:rPr>
+          <w:sz w:val="22"/>
+        </w:rPr>
+      </w:pPr>
+      <w:proofErr w:type="spellStart"/>
+      <w:r>
+        <w:rPr>
+          <w:rFonts w:hint="eastAsia"/>
+          <w:sz w:val="22"/>
+        </w:rPr>
+        <w:t>청크</w:t>
+      </w:r>
+      <w:proofErr w:type="spellEnd"/>
+      <w:r>
+        <w:rPr>
+          <w:rFonts w:hint="eastAsia"/>
+          <w:sz w:val="22"/>
+        </w:rPr>
+        <w:t xml:space="preserve"> 구조와 플레이어의 시야 범위를 고려, 플레이어가 움직일 수 있는 범위보다 더 넓게 레벨을 디자</w:t>
+      </w:r>
+      <w:r>
+        <w:rPr>
+          <w:rFonts w:hint="eastAsia"/>
+          <w:sz w:val="22"/>
+        </w:rPr>
+        <w:t>인</w:t>
       </w:r>
     </w:p>
     <w:p>
@@ -810,7 +1659,7 @@
           <w:rFonts w:hint="eastAsia"/>
           <w:sz w:val="22"/>
         </w:rPr>
-        <w:t>피격 시 넉백 구현</w:t>
+        <w:t>Zone 시스템 추가</w:t>
       </w:r>
     </w:p>
     <w:p>
@@ -831,7 +1680,23 @@
           <w:rFonts w:hint="eastAsia"/>
           <w:sz w:val="22"/>
         </w:rPr>
-        <w:t>피격 시 스킬 스크립트에 명시된 충격량을 충돌 부위에 적용</w:t>
+        <w:t xml:space="preserve">특정한 </w:t>
+      </w:r>
+      <w:proofErr w:type="spellStart"/>
+      <w:r>
+        <w:rPr>
+          <w:rFonts w:hint="eastAsia"/>
+          <w:sz w:val="22"/>
+        </w:rPr>
+        <w:t>팩션의</w:t>
+      </w:r>
+      <w:proofErr w:type="spellEnd"/>
+      <w:r>
+        <w:rPr>
+          <w:rFonts w:hint="eastAsia"/>
+          <w:sz w:val="22"/>
+        </w:rPr>
+        <w:t xml:space="preserve"> 객체가 수작업으로 만든 Bounding Volume 내로 진입하면 이벤트를 발생시킬 수 있는 시스템</w:t>
       </w:r>
     </w:p>
     <w:p>
@@ -847,12 +1712,53 @@
           <w:sz w:val="22"/>
         </w:rPr>
       </w:pPr>
-      <w:r>
-        <w:rPr>
-          <w:rFonts w:hint="eastAsia"/>
-          <w:sz w:val="22"/>
-        </w:rPr>
-        <w:t>사망으로 인해 랙돌화되었을 때 충격량으로 인해 튕겨나가도록 연출</w:t>
+      <w:proofErr w:type="spellStart"/>
+      <w:r>
+        <w:rPr>
+          <w:rFonts w:hint="eastAsia"/>
+          <w:sz w:val="22"/>
+        </w:rPr>
+        <w:t>ZoneEnter</w:t>
+      </w:r>
+      <w:proofErr w:type="spellEnd"/>
+      <w:r>
+        <w:rPr>
+          <w:rFonts w:hint="eastAsia"/>
+          <w:sz w:val="22"/>
+        </w:rPr>
+        <w:t xml:space="preserve">, </w:t>
+      </w:r>
+      <w:proofErr w:type="spellStart"/>
+      <w:r>
+        <w:rPr>
+          <w:rFonts w:hint="eastAsia"/>
+          <w:sz w:val="22"/>
+        </w:rPr>
+        <w:t>ZoneStay</w:t>
+      </w:r>
+      <w:proofErr w:type="spellEnd"/>
+      <w:r>
+        <w:rPr>
+          <w:rFonts w:hint="eastAsia"/>
+          <w:sz w:val="22"/>
+        </w:rPr>
+        <w:t xml:space="preserve">, </w:t>
+      </w:r>
+      <w:proofErr w:type="spellStart"/>
+      <w:r>
+        <w:rPr>
+          <w:rFonts w:hint="eastAsia"/>
+          <w:sz w:val="22"/>
+        </w:rPr>
+        <w:t>ZoneLeave</w:t>
+      </w:r>
+      <w:proofErr w:type="spellEnd"/>
+      <w:r>
+        <w:rPr>
+          <w:rFonts w:hint="eastAsia"/>
+          <w:sz w:val="22"/>
+        </w:rPr>
+        <w:t>의 세 가지 이벤트로 나누어서 처리</w:t>
       </w:r>
     </w:p>
     <w:p>
@@ -873,74 +1779,23 @@
           <w:rFonts w:hint="eastAsia"/>
           <w:sz w:val="22"/>
         </w:rPr>
-        <w:t xml:space="preserve">물리 시스템에 motor 기능 </w:t>
-      </w:r>
-      <w:proofErr w:type="gramStart"/>
-      <w:r>
-        <w:rPr>
-          <w:rFonts w:hint="eastAsia"/>
-          <w:sz w:val="22"/>
-        </w:rPr>
-        <w:t>추가 해</w:t>
-      </w:r>
-      <w:proofErr w:type="gramEnd"/>
-      <w:r>
-        <w:rPr>
-          <w:rFonts w:hint="eastAsia"/>
-          <w:sz w:val="22"/>
-        </w:rPr>
-        <w:t xml:space="preserve"> 목표 속도로 가/감속하도록 구현</w:t>
-      </w:r>
-    </w:p>
-    <w:p>
-      <w:pPr>
-        <w:pStyle w:val="a3"/>
-        <w:numPr>
-          <w:ilvl w:val="2"/>
-          <w:numId w:val="1"/>
-        </w:numPr>
-        <w:ind w:leftChars="0"/>
-        <w:jc w:val="left"/>
-        <w:rPr>
-          <w:sz w:val="22"/>
-        </w:rPr>
-      </w:pPr>
-      <w:r>
-        <w:rPr>
-          <w:rFonts w:hint="eastAsia"/>
-          <w:sz w:val="22"/>
-        </w:rPr>
-        <w:t>충격량으로 인한 물리적 속도 변화와 AI의 이동 명령에 의한 속도 변화 효과를 조합, AI가 설정한 속도는 이제 motor의 desired velocity를 설정하고, 물리 시스템은</w:t>
-      </w:r>
-      <w:r>
-        <w:rPr>
-          <w:sz w:val="22"/>
-        </w:rPr>
-        <w:br/>
-      </w:r>
-      <w:r>
-        <w:rPr>
-          <w:rFonts w:hint="eastAsia"/>
-          <w:sz w:val="22"/>
-        </w:rPr>
-        <w:t>desired velocity에 도달하도록 힘을 가하는 한편 충돌 처리와 댐핑을 함께 수행함.</w:t>
-      </w:r>
-    </w:p>
-    <w:p>
-      <w:pPr>
-        <w:widowControl/>
-        <w:wordWrap/>
-        <w:autoSpaceDE/>
-        <w:autoSpaceDN/>
-        <w:rPr>
-          <w:sz w:val="22"/>
-        </w:rPr>
-      </w:pPr>
-      <w:r>
-        <w:rPr>
-          <w:sz w:val="22"/>
-        </w:rPr>
-        <w:br w:type="page"/>
+        <w:t xml:space="preserve">집단 전투 아레나에 </w:t>
+      </w:r>
+      <w:proofErr w:type="spellStart"/>
+      <w:r>
+        <w:rPr>
+          <w:rFonts w:hint="eastAsia"/>
+          <w:sz w:val="22"/>
+        </w:rPr>
+        <w:t>ZoneEnter</w:t>
+      </w:r>
+      <w:proofErr w:type="spellEnd"/>
+      <w:r>
+        <w:rPr>
+          <w:rFonts w:hint="eastAsia"/>
+          <w:sz w:val="22"/>
+        </w:rPr>
+        <w:t>하게 되면, 중간 보스가 나타나고 가상의 벽이 세워져 지역을 벗어날 수 없게 될 예정 (현재 가상의 벽은 실제 구현 완료)</w:t>
       </w:r>
     </w:p>
     <w:p>
@@ -953,277 +1808,7 @@
         <w:ind w:leftChars="0"/>
         <w:jc w:val="left"/>
         <w:rPr>
-          <w:sz w:val="22"/>
-        </w:rPr>
-      </w:pPr>
-      <w:r>
-        <w:rPr>
-          <w:sz w:val="22"/>
-        </w:rPr>
-        <w:lastRenderedPageBreak/>
-        <w:t>R</w:t>
-      </w:r>
-      <w:r>
-        <w:rPr>
-          <w:rFonts w:hint="eastAsia"/>
-          <w:sz w:val="22"/>
-        </w:rPr>
-        <w:t>agdoll body마다 damping과 noise 별도 설정 등 보정</w:t>
-      </w:r>
-    </w:p>
-    <w:p>
-      <w:pPr>
-        <w:pStyle w:val="a3"/>
-        <w:numPr>
-          <w:ilvl w:val="1"/>
-          <w:numId w:val="1"/>
-        </w:numPr>
-        <w:ind w:leftChars="0"/>
-        <w:jc w:val="left"/>
-        <w:rPr>
-          <w:sz w:val="22"/>
-        </w:rPr>
-      </w:pPr>
-      <w:r>
-        <w:rPr>
-          <w:rFonts w:hint="eastAsia"/>
-          <w:sz w:val="22"/>
-        </w:rPr>
-        <w:t>자연스러운 ragdoll simulation을 위해 목과 머리 등 꺾였을 때 부자연스러운 부위와 아래팔, 아랫다리 등 많이 꺾여도 덜 부자연스러운 부위의 damping을 다르게 설정함</w:t>
-      </w:r>
-    </w:p>
-    <w:p>
-      <w:pPr>
-        <w:pStyle w:val="a3"/>
-        <w:numPr>
-          <w:ilvl w:val="1"/>
-          <w:numId w:val="1"/>
-        </w:numPr>
-        <w:ind w:leftChars="0"/>
-        <w:jc w:val="left"/>
-        <w:rPr>
-          <w:sz w:val="22"/>
-        </w:rPr>
-      </w:pPr>
-      <w:r>
-        <w:rPr>
-          <w:rFonts w:hint="eastAsia"/>
-          <w:sz w:val="22"/>
-        </w:rPr>
-        <w:t>피격으로 인한 넉백 등이 발생할 때, 단조로운 넉백 연출을 방지하기 위해 각 ragdoll body에 random noise impulse를 추가로 작게 적용, 부위별로 noise 계수를 달리해 안정화</w:t>
-      </w:r>
-    </w:p>
-    <w:p>
-      <w:pPr>
-        <w:pStyle w:val="a3"/>
-        <w:numPr>
-          <w:ilvl w:val="0"/>
-          <w:numId w:val="1"/>
-        </w:numPr>
-        <w:ind w:leftChars="0"/>
-        <w:jc w:val="left"/>
-        <w:rPr>
-          <w:sz w:val="22"/>
-        </w:rPr>
-      </w:pPr>
-      <w:r>
-        <w:rPr>
-          <w:rFonts w:hint="eastAsia"/>
-          <w:sz w:val="22"/>
-        </w:rPr>
-        <w:t>아군 공격 방지</w:t>
-      </w:r>
-    </w:p>
-    <w:p>
-      <w:pPr>
-        <w:pStyle w:val="a3"/>
-        <w:numPr>
-          <w:ilvl w:val="1"/>
-          <w:numId w:val="1"/>
-        </w:numPr>
-        <w:ind w:leftChars="0"/>
-        <w:jc w:val="left"/>
-        <w:rPr>
-          <w:sz w:val="22"/>
-        </w:rPr>
-      </w:pPr>
-      <w:r>
-        <w:rPr>
-          <w:rFonts w:hint="eastAsia"/>
-          <w:sz w:val="22"/>
-        </w:rPr>
-        <w:t>Faction bit를 설정하고 enum에 대응시켜, 공격 가능 faction들을 bitwise-or로 연산,</w:t>
-      </w:r>
-      <w:r>
-        <w:rPr>
-          <w:sz w:val="22"/>
-        </w:rPr>
-        <w:br/>
-      </w:r>
-      <w:r>
-        <w:rPr>
-          <w:rFonts w:hint="eastAsia"/>
-          <w:sz w:val="22"/>
-        </w:rPr>
-        <w:t>공격 가능한 faction의 객체들에 대해서만 피격 충돌처리 수행</w:t>
-      </w:r>
-    </w:p>
-    <w:p>
-      <w:pPr>
-        <w:pStyle w:val="a3"/>
-        <w:numPr>
-          <w:ilvl w:val="0"/>
-          <w:numId w:val="1"/>
-        </w:numPr>
-        <w:ind w:leftChars="0"/>
-        <w:jc w:val="left"/>
-        <w:rPr>
-          <w:sz w:val="22"/>
-        </w:rPr>
-      </w:pPr>
-      <w:r>
-        <w:rPr>
-          <w:rFonts w:hint="eastAsia"/>
-          <w:sz w:val="22"/>
-        </w:rPr>
-        <w:t>충돌 피드백 튜닝</w:t>
-      </w:r>
-    </w:p>
-    <w:p>
-      <w:pPr>
-        <w:pStyle w:val="a3"/>
-        <w:numPr>
-          <w:ilvl w:val="1"/>
-          <w:numId w:val="1"/>
-        </w:numPr>
-        <w:ind w:leftChars="0"/>
-        <w:jc w:val="left"/>
-        <w:rPr>
-          <w:sz w:val="22"/>
-        </w:rPr>
-      </w:pPr>
-      <w:r>
-        <w:rPr>
-          <w:sz w:val="22"/>
-        </w:rPr>
-        <w:t>C</w:t>
-      </w:r>
-      <w:r>
-        <w:rPr>
-          <w:rFonts w:hint="eastAsia"/>
-          <w:sz w:val="22"/>
-        </w:rPr>
-        <w:t>ontact constraint를 생성하여 baumgarte</w:t>
-      </w:r>
-      <w:r>
-        <w:rPr>
-          <w:rFonts w:hint="eastAsia"/>
-          <w:sz w:val="22"/>
-        </w:rPr>
-        <w:t xml:space="preserve"> stabilization과 split impulse를 적용하는 방식은</w:t>
-      </w:r>
-      <w:r>
-        <w:rPr>
-          <w:sz w:val="22"/>
-        </w:rPr>
-        <w:br/>
-      </w:r>
-      <w:r>
-        <w:rPr>
-          <w:rFonts w:hint="eastAsia"/>
-          <w:sz w:val="22"/>
-        </w:rPr>
-        <w:t>static 객체가 포함된 충돌의 해소 과정에는 적합하지 않음</w:t>
-      </w:r>
-    </w:p>
-    <w:p>
-      <w:pPr>
-        <w:pStyle w:val="a3"/>
-        <w:numPr>
-          <w:ilvl w:val="2"/>
-          <w:numId w:val="1"/>
-        </w:numPr>
-        <w:ind w:leftChars="0"/>
-        <w:jc w:val="left"/>
-        <w:rPr>
-          <w:sz w:val="22"/>
-        </w:rPr>
-      </w:pPr>
-      <w:r>
-        <w:rPr>
-          <w:sz w:val="22"/>
-        </w:rPr>
-        <w:t>S</w:t>
-      </w:r>
-      <w:r>
-        <w:rPr>
-          <w:rFonts w:hint="eastAsia"/>
-          <w:sz w:val="22"/>
-        </w:rPr>
-        <w:t>tatic은 어차피 가만히 있을 건데 불필요한 연산이 너무 많다.</w:t>
-      </w:r>
-    </w:p>
-    <w:p>
-      <w:pPr>
-        <w:pStyle w:val="a3"/>
-        <w:numPr>
-          <w:ilvl w:val="2"/>
-          <w:numId w:val="1"/>
-        </w:numPr>
-        <w:ind w:leftChars="0"/>
-        <w:jc w:val="left"/>
-        <w:rPr>
-          <w:sz w:val="22"/>
-        </w:rPr>
-      </w:pPr>
-      <w:r>
-        <w:rPr>
-          <w:sz w:val="22"/>
-        </w:rPr>
-        <w:t>S</w:t>
-      </w:r>
-      <w:r>
-        <w:rPr>
-          <w:rFonts w:hint="eastAsia"/>
-          <w:sz w:val="22"/>
-        </w:rPr>
-        <w:t>tatic의 질량을 무한으로 가정하면서 비정상적으로 큰 피드백이 발생할 수 있다.</w:t>
-      </w:r>
-    </w:p>
-    <w:p>
-      <w:pPr>
-        <w:pStyle w:val="a3"/>
-        <w:numPr>
-          <w:ilvl w:val="1"/>
-          <w:numId w:val="1"/>
-        </w:numPr>
-        <w:ind w:leftChars="0"/>
-        <w:jc w:val="left"/>
-        <w:rPr>
-          <w:sz w:val="22"/>
-        </w:rPr>
-      </w:pPr>
-      <w:r>
-        <w:rPr>
-          <w:sz w:val="22"/>
-        </w:rPr>
-        <w:t>S</w:t>
-      </w:r>
-      <w:r>
-        <w:rPr>
-          <w:rFonts w:hint="eastAsia"/>
-          <w:sz w:val="22"/>
-        </w:rPr>
-        <w:t>tatic 객체가 포함된 충돌 해소는 static 객체의 안쪽으로 침투한 만큼을 단순 해소하는 로직으로 수정,</w:t>
-      </w:r>
-    </w:p>
-    <w:p>
-      <w:pPr>
-        <w:widowControl/>
-        <w:wordWrap/>
-        <w:autoSpaceDE/>
-        <w:autoSpaceDN/>
-        <w:rPr>
+          <w:rFonts w:hint="eastAsia"/>
           <w:sz w:val="22"/>
         </w:rPr>
       </w:pPr>
@@ -1233,20 +1818,6 @@
         </w:rPr>
         <w:br w:type="page"/>
       </w:r>
-    </w:p>
-    <w:p>
-      <w:pPr>
-        <w:pStyle w:val="a3"/>
-        <w:numPr>
-          <w:ilvl w:val="0"/>
-          <w:numId w:val="1"/>
-        </w:numPr>
-        <w:ind w:leftChars="0"/>
-        <w:jc w:val="left"/>
-        <w:rPr>
-          <w:sz w:val="22"/>
-        </w:rPr>
-      </w:pPr>
     </w:p>
     <w:p>
       <w:pPr>
@@ -1262,6 +1833,7 @@
           <w:sz w:val="28"/>
           <w:szCs w:val="32"/>
         </w:rPr>
+        <w:lastRenderedPageBreak/>
         <w:t>이종진:</w:t>
       </w:r>
     </w:p>
@@ -1329,7 +1901,43 @@
           <w:sz w:val="18"/>
           <w:szCs w:val="20"/>
         </w:rPr>
-        <w:t>유니티 VFX 에셋을 사용하려 할 때 그 에셋이 Unity 시스템 중 하나인 Shader Graph를 사용한다면</w:t>
+        <w:t xml:space="preserve">유니티 VFX </w:t>
+      </w:r>
+      <w:proofErr w:type="spellStart"/>
+      <w:r>
+        <w:rPr>
+          <w:rFonts w:hint="eastAsia"/>
+          <w:sz w:val="18"/>
+          <w:szCs w:val="20"/>
+        </w:rPr>
+        <w:t>에셋을</w:t>
+      </w:r>
+      <w:proofErr w:type="spellEnd"/>
+      <w:r>
+        <w:rPr>
+          <w:rFonts w:hint="eastAsia"/>
+          <w:sz w:val="18"/>
+          <w:szCs w:val="20"/>
+        </w:rPr>
+        <w:t xml:space="preserve"> 사용하려 할 때 그 </w:t>
+      </w:r>
+      <w:proofErr w:type="spellStart"/>
+      <w:r>
+        <w:rPr>
+          <w:rFonts w:hint="eastAsia"/>
+          <w:sz w:val="18"/>
+          <w:szCs w:val="20"/>
+        </w:rPr>
+        <w:t>에셋이</w:t>
+      </w:r>
+      <w:proofErr w:type="spellEnd"/>
+      <w:r>
+        <w:rPr>
+          <w:rFonts w:hint="eastAsia"/>
+          <w:sz w:val="18"/>
+          <w:szCs w:val="20"/>
+        </w:rPr>
+        <w:t xml:space="preserve"> Unity 시스템 중 하나인 Shader Graph를 사용한다면</w:t>
       </w:r>
       <w:r>
         <w:rPr>
@@ -1370,7 +1978,25 @@
           <w:sz w:val="18"/>
           <w:szCs w:val="20"/>
         </w:rPr>
-        <w:t>Hit, Muzzle 같이 평면적으로 보여도 괜찮은 이펙트들은 재생한 모습을 녹화를 해서 스프라이트로 만들어</w:t>
+        <w:t xml:space="preserve">Hit, Muzzle 같이 평면적으로 보여도 괜찮은 이펙트들은 재생한 모습을 녹화를 해서 </w:t>
+      </w:r>
+      <w:proofErr w:type="spellStart"/>
+      <w:r>
+        <w:rPr>
+          <w:rFonts w:hint="eastAsia"/>
+          <w:sz w:val="18"/>
+          <w:szCs w:val="20"/>
+        </w:rPr>
+        <w:t>스프라이트로</w:t>
+      </w:r>
+      <w:proofErr w:type="spellEnd"/>
+      <w:r>
+        <w:rPr>
+          <w:rFonts w:hint="eastAsia"/>
+          <w:sz w:val="18"/>
+          <w:szCs w:val="20"/>
+        </w:rPr>
+        <w:t xml:space="preserve"> 만들어</w:t>
       </w:r>
       <w:r>
         <w:rPr>
@@ -1473,7 +2099,29 @@
           <w:sz w:val="18"/>
           <w:szCs w:val="20"/>
         </w:rPr>
-        <w:t>Arrow, Arrow Rain, Arrow Volley, EnergyExplosionArrow, Tornado Shot 추가</w:t>
+        <w:t xml:space="preserve">Arrow, Arrow Rain, Arrow Volley, </w:t>
+      </w:r>
+      <w:proofErr w:type="spellStart"/>
+      <w:r>
+        <w:rPr>
+          <w:rFonts w:hint="eastAsia"/>
+          <w:b/>
+          <w:bCs/>
+          <w:sz w:val="18"/>
+          <w:szCs w:val="20"/>
+        </w:rPr>
+        <w:t>EnergyExplosionArrow</w:t>
+      </w:r>
+      <w:proofErr w:type="spellEnd"/>
+      <w:r>
+        <w:rPr>
+          <w:rFonts w:hint="eastAsia"/>
+          <w:b/>
+          <w:bCs/>
+          <w:sz w:val="18"/>
+          <w:szCs w:val="20"/>
+        </w:rPr>
+        <w:t>, Tornado Shot 추가</w:t>
       </w:r>
       <w:r>
         <w:rPr>
@@ -1561,7 +2209,25 @@
           <w:sz w:val="18"/>
           <w:szCs w:val="20"/>
         </w:rPr>
-        <w:t xml:space="preserve">Bake한 이미지를 이용해 EnergyExplosionArrow 이펙트를 쉽게 추가했다. </w:t>
+        <w:t xml:space="preserve">Bake한 이미지를 이용해 </w:t>
+      </w:r>
+      <w:proofErr w:type="spellStart"/>
+      <w:r>
+        <w:rPr>
+          <w:rFonts w:hint="eastAsia"/>
+          <w:sz w:val="18"/>
+          <w:szCs w:val="20"/>
+        </w:rPr>
+        <w:t>EnergyExplosionArrow</w:t>
+      </w:r>
+      <w:proofErr w:type="spellEnd"/>
+      <w:r>
+        <w:rPr>
+          <w:rFonts w:hint="eastAsia"/>
+          <w:sz w:val="18"/>
+          <w:szCs w:val="20"/>
+        </w:rPr>
+        <w:t xml:space="preserve"> 이펙트를 쉽게 추가했다. </w:t>
       </w:r>
     </w:p>
     <w:p>
@@ -1620,12 +2286,21 @@
           <w:b/>
         </w:rPr>
       </w:pPr>
+      <w:proofErr w:type="spellStart"/>
       <w:r>
         <w:rPr>
           <w:rFonts w:hint="eastAsia"/>
           <w:b/>
         </w:rPr>
-        <w:t xml:space="preserve">이시스 전술 전투 구현 </w:t>
+        <w:t>이시스</w:t>
+      </w:r>
+      <w:proofErr w:type="spellEnd"/>
+      <w:r>
+        <w:rPr>
+          <w:rFonts w:hint="eastAsia"/>
+          <w:b/>
+        </w:rPr>
+        <w:t xml:space="preserve"> 전술 전투 구현 </w:t>
       </w:r>
       <w:r>
         <w:rPr>
@@ -1664,7 +2339,15 @@
         <w:ind w:leftChars="0"/>
       </w:pPr>
       <w:r>
-        <w:t>어느 부대든 생존 인원이 초기 인원의 80% 미만으로 줄어들면 전술이 해금</w:t>
+        <w:t xml:space="preserve">어느 </w:t>
+      </w:r>
+      <w:proofErr w:type="spellStart"/>
+      <w:r>
+        <w:t>부대든</w:t>
+      </w:r>
+      <w:proofErr w:type="spellEnd"/>
+      <w:r>
+        <w:t xml:space="preserve"> 생존 인원이 초기 인원의 80% 미만으로 줄어들면 전술이 해금</w:t>
       </w:r>
       <w:r>
         <w:rPr>
@@ -1678,11 +2361,19 @@
       <w:r>
         <w:br/>
       </w:r>
-      <w:r>
-        <w:rPr>
-          <w:rFonts w:hint="eastAsia"/>
-        </w:rPr>
-        <w:t>봄버 부대</w:t>
+      <w:proofErr w:type="spellStart"/>
+      <w:r>
+        <w:rPr>
+          <w:rFonts w:hint="eastAsia"/>
+        </w:rPr>
+        <w:t>봄버</w:t>
+      </w:r>
+      <w:proofErr w:type="spellEnd"/>
+      <w:r>
+        <w:rPr>
+          <w:rFonts w:hint="eastAsia"/>
+        </w:rPr>
+        <w:t xml:space="preserve"> 부대</w:t>
       </w:r>
       <w:r>
         <w:t>는 플레이어 군집 중 위협도가 높은 최대 2개 군집을 골라 좌우에서</w:t>
@@ -1852,6 +2543,7 @@
       <w:r>
         <w:t xml:space="preserve"> 끝나면 </w:t>
       </w:r>
+      <w:proofErr w:type="spellStart"/>
       <w:r>
         <w:rPr>
           <w:rFonts w:hint="eastAsia"/>
@@ -1859,7 +2551,11 @@
         <w:t>쿨타임</w:t>
       </w:r>
       <w:r>
-        <w:t>에 들어</w:t>
+        <w:t>에</w:t>
+      </w:r>
+      <w:proofErr w:type="spellEnd"/>
+      <w:r>
+        <w:t xml:space="preserve"> 들어</w:t>
       </w:r>
       <w:r>
         <w:rPr>
@@ -1873,8 +2569,13 @@
       <w:r>
         <w:br/>
       </w:r>
-      <w:r>
-        <w:t>쿨타임은 매번 7~13초 사이에서 랜덤으로 정해</w:t>
+      <w:proofErr w:type="spellStart"/>
+      <w:r>
+        <w:t>쿨타임은</w:t>
+      </w:r>
+      <w:proofErr w:type="spellEnd"/>
+      <w:r>
+        <w:t xml:space="preserve"> 매번 7~13초 사이에서 랜덤으로 정해</w:t>
       </w:r>
       <w:r>
         <w:rPr>
@@ -2235,16 +2936,19 @@
                 <w:bCs/>
                 <w:szCs w:val="20"/>
               </w:rPr>
-              <w:t>스킬 추가 구현 및 몬스터 패턴 구현, 레벨 디자인, 네비메시 추출</w:t>
-            </w:r>
-            <w:r>
-              <w:rPr>
+              <w:t xml:space="preserve">스킬 추가 구현 및 몬스터 패턴 구현, 레벨 디자인, </w:t>
+            </w:r>
+            <w:proofErr w:type="spellStart"/>
+            <w:r>
+              <w:rPr>
+                <w:rFonts w:hint="eastAsia"/>
                 <w:b/>
                 <w:bCs/>
                 <w:szCs w:val="20"/>
               </w:rPr>
-              <w:br/>
-            </w:r>
+              <w:t>네비메시</w:t>
+            </w:r>
+            <w:proofErr w:type="spellEnd"/>
             <w:r>
               <w:rPr>
                 <w:rFonts w:hint="eastAsia"/>
@@ -2252,17 +2956,36 @@
                 <w:bCs/>
                 <w:szCs w:val="20"/>
               </w:rPr>
-              <w:t xml:space="preserve">이종진: </w:t>
-            </w:r>
-            <w:r>
-              <w:rPr>
-                <w:rFonts w:hint="eastAsia"/>
+              <w:t xml:space="preserve"> 추출</w:t>
+            </w:r>
+            <w:r>
+              <w:rPr>
                 <w:b/>
                 <w:bCs/>
                 <w:szCs w:val="20"/>
               </w:rPr>
+              <w:br/>
+            </w:r>
+            <w:r>
+              <w:rPr>
+                <w:rFonts w:hint="eastAsia"/>
+                <w:b/>
+                <w:bCs/>
+                <w:szCs w:val="20"/>
+              </w:rPr>
+              <w:t xml:space="preserve">이종진: </w:t>
+            </w:r>
+            <w:proofErr w:type="spellStart"/>
+            <w:r>
+              <w:rPr>
+                <w:rFonts w:hint="eastAsia"/>
+                <w:b/>
+                <w:bCs/>
+                <w:szCs w:val="20"/>
+              </w:rPr>
               <w:t>로비씬</w:t>
             </w:r>
+            <w:proofErr w:type="spellEnd"/>
             <w:r>
               <w:rPr>
                 <w:rFonts w:hint="eastAsia"/>

</xml_diff>